<commit_message>
Update report with GitHub folder screenshot
</commit_message>
<xml_diff>
--- a/Assignment2/MathewAlleyne_BDA400_A02.docx
+++ b/Assignment2/MathewAlleyne_BDA400_A02.docx
@@ -2964,10 +2964,42 @@
       <w:pPr>
         <w:pStyle w:val="BlockText"/>
       </w:pPr>
+      <w:r>
+        <w:drawing>
+          <wp:inline>
+            <wp:extent cx="5486400" cy="2349593"/>
+            <wp:docPr id="24" name="Picture 24"/>
+            <wp:cNvGraphicFramePr>
+              <a:graphicFrameLocks noChangeAspect="1"/>
+            </wp:cNvGraphicFramePr>
+            <a:graphic>
+              <a:graphicData uri="http://schemas.openxmlformats.org/drawingml/2006/picture">
+                <pic:pic>
+                  <pic:nvPicPr>
+                    <pic:cNvPr id="0" name="9_1_github_assignment2_folder.jpg"/>
+                    <pic:cNvPicPr/>
+                  </pic:nvPicPr>
+                  <pic:blipFill>
+                    <a:blip r:embed="rId35"/>
+                    <a:stretch>
+                      <a:fillRect/>
+                    </a:stretch>
+                  </pic:blipFill>
+                  <pic:spPr>
+                    <a:xfrm>
+                      <a:off x="0" y="0"/>
+                      <a:ext cx="5486400" cy="2349593"/>
+                    </a:xfrm>
+                    <a:prstGeom prst="rect"/>
+                  </pic:spPr>
+                </pic:pic>
+              </a:graphicData>
+            </a:graphic>
+          </wp:inline>
+        </w:drawing>
+      </w:r>
       <w:r/>
-      <w:r>
-        <w:t>[Insert screenshot here]</w:t>
-      </w:r>
+      <w:r/>
     </w:p>
     <w:bookmarkEnd w:id="32"/>
     <w:bookmarkStart w:id="33" w:name="verification"/>

</xml_diff>